<commit_message>
docs: add GitHub repo link to 개발보고서 cover page
표지에 GitHub 저장소 링크가 빠져있다는 피드백에 따라 공식 보고서와 동일한
형식으로 추가했다.

Co-Authored-By: Claude Sonnet 5 <noreply@anthropic.com>
</commit_message>
<xml_diff>
--- a/docs/hackathon/MJC_AI_Campus_Agent_개발보고서.docx
+++ b/docs/hackathon/MJC_AI_Campus_Agent_개발보고서.docx
@@ -72,6 +72,20 @@
           <w:sz w:val="20"/>
         </w:rPr>
         <w:t>CodeOneBite Team | 2026년 8월</w:t>
+      </w:r>
+    </w:p>
+    <w:p>
+      <w:pPr>
+        <w:jc w:val="center"/>
+      </w:pPr>
+      <w:r>
+        <w:rPr>
+          <w:rFonts w:ascii="맑은 고딕" w:hAnsi="맑은 고딕" w:eastAsia="맑은 고딕"/>
+          <w:b w:val="0"/>
+          <w:color w:val="172033"/>
+          <w:sz w:val="20"/>
+        </w:rPr>
+        <w:t>GitHub  https://github.com/hoo419/mjc-ai-hackathon-codeonebite-team</w:t>
       </w:r>
     </w:p>
     <w:p>

</xml_diff>

<commit_message>
fix: make GitHub cover link actually clickable in 개발보고서
이전 커밋은 표지에 GitHub 주소를 텍스트로만 추가해 클릭이 안 됐다.
PDF는 reportlab <link> 태그로 실제 URI 어노테이션을, DOCX는
w:hyperlink 관계(rId)를 추가해 두 포맷 모두에서 클릭 시 저장소로
바로 이동하도록 했다.

Co-Authored-By: Claude Sonnet 5 <noreply@anthropic.com>
</commit_message>
<xml_diff>
--- a/docs/hackathon/MJC_AI_Campus_Agent_개발보고서.docx
+++ b/docs/hackathon/MJC_AI_Campus_Agent_개발보고서.docx
@@ -85,8 +85,19 @@
           <w:color w:val="172033"/>
           <w:sz w:val="20"/>
         </w:rPr>
-        <w:t>GitHub  https://github.com/hoo419/mjc-ai-hackathon-codeonebite-team</w:t>
+        <w:t xml:space="preserve">GitHub  </w:t>
       </w:r>
+      <w:hyperlink r:id="rId9">
+        <w:r>
+          <w:rPr>
+            <w:rFonts w:eastAsia="맑은 고딕"/>
+            <w:sz w:val="20"/>
+            <w:color w:val="1677FF"/>
+            <w:u w:val="single"/>
+          </w:rPr>
+          <w:t>https://github.com/hoo419/mjc-ai-hackathon-codeonebite-team</w:t>
+        </w:r>
+      </w:hyperlink>
     </w:p>
     <w:p>
       <w:r>
@@ -3757,7 +3768,7 @@
     </w:tbl>
     <w:p/>
     <w:sectPr>
-      <w:footerReference w:type="default" r:id="rId9"/>
+      <w:footerReference w:type="default" r:id="rId10"/>
       <w:pgSz w:w="11906" w:h="16838"/>
       <w:pgMar w:top="1134" w:right="1134" w:bottom="1134" w:left="1134" w:header="709" w:footer="709" w:gutter="0"/>
       <w:cols w:space="720"/>

</xml_diff>